<commit_message>
Add a No. KTP field to the Surat Kuasa's authorized-person section
Co-Authored-By: Claude Sonnet 5 <noreply@anthropic.com>
</commit_message>
<xml_diff>
--- a/public/documents/surat-kuasa-paulus-fun-run-2026.docx
+++ b/public/documents/surat-kuasa-paulus-fun-run-2026.docx
@@ -189,6 +189,27 @@
         <w:tab/>
         <w:tab/>
         <w:t xml:space="preserve">:  </w:t>
+      </w:r>
+    </w:p>
+    <w:p>
+      <w:pPr>
+        <w:spacing w:after="0" w:line="240" w:lineRule="auto"/>
+        <w:rPr>
+          <w:rFonts w:ascii="Times" w:cs="Times" w:eastAsia="Times" w:hAnsi="Times"/>
+          <w:sz w:val="24"/>
+          <w:szCs w:val="24"/>
+        </w:rPr>
+      </w:pPr>
+      <w:r>
+        <w:rPr>
+          <w:rFonts w:ascii="Times" w:cs="Times" w:eastAsia="Times" w:hAnsi="Times"/>
+          <w:sz w:val="24"/>
+          <w:szCs w:val="24"/>
+          <w:rtl w:val="0"/>
+        </w:rPr>
+        <w:t xml:space="preserve">No. KTP</w:t>
+        <w:tab/>
+        <w:t xml:space="preserve">:</w:t>
       </w:r>
     </w:p>
     <w:p>

</xml_diff>